<commit_message>
WITNESS-3 Zenodo publication: DOI 10.5281/zenodo.21434832
Published WITNESS-3 'Cosmic Beacon' to Zenodo. Updated report and README with
DOI, execution commit, and publication status.

- Zenodo DOI: 10.5281/zenodo.21434832
- Record: https://zenodo.org/record/21434832
- Deposition: 21434832
- Tarball: witness-3.tar.gz (181 KB)

All WITNESS-3 documentation now reflects Published status with full DOI links.
</commit_message>
<xml_diff>
--- a/witness-3/results/WITNESS-3-report.docx
+++ b/witness-3/results/WITNESS-3-report.docx
@@ -2,7 +2,7 @@
 <file path=word/document.xml><?xml version="1.0" encoding="utf-8"?>
 <w:document xmlns:w="http://schemas.openxmlformats.org/wordprocessingml/2006/main" xmlns:m="http://schemas.openxmlformats.org/officeDocument/2006/math" xmlns:r="http://schemas.openxmlformats.org/officeDocument/2006/relationships" xmlns:o="urn:schemas-microsoft-com:office:office" xmlns:v="urn:schemas-microsoft-com:vml" xmlns:w10="urn:schemas-microsoft-com:office:word" xmlns:a="http://schemas.openxmlformats.org/drawingml/2006/main" xmlns:pic="http://schemas.openxmlformats.org/drawingml/2006/picture" xmlns:wp="http://schemas.openxmlformats.org/drawingml/2006/wordprocessingDrawing">
   <w:body>
-    <w:bookmarkStart w:id="43" w:name="witness-3-execution-report"/>
+    <w:bookmarkStart w:id="44" w:name="witness-3-execution-report"/>
     <w:p>
       <w:pPr>
         <w:pStyle w:val="Heading1"/>
@@ -4346,7 +4346,7 @@
       </w:r>
     </w:p>
     <w:bookmarkEnd w:id="37"/>
-    <w:bookmarkStart w:id="42" w:name="references"/>
+    <w:bookmarkStart w:id="43" w:name="references"/>
     <w:p>
       <w:pPr>
         <w:pStyle w:val="Heading2"/>
@@ -4539,6 +4539,67 @@
           <w:bCs/>
           <w:b/>
         </w:rPr>
+        <w:t xml:space="preserve">Execution commit:</w:t>
+      </w:r>
+      <w:r>
+        <w:t xml:space="preserve"> </w:t>
+      </w:r>
+      <w:r>
+        <w:rPr>
+          <w:rStyle w:val="VerbatimChar"/>
+        </w:rPr>
+        <w:t xml:space="preserve">6fccdb6</w:t>
+      </w:r>
+      <w:r>
+        <w:t xml:space="preserve"> </w:t>
+      </w:r>
+      <w:r>
+        <w:t xml:space="preserve">(2026-07-18,</w:t>
+      </w:r>
+      <w:r>
+        <w:t xml:space="preserve"> </w:t>
+      </w:r>
+      <w:r>
+        <w:rPr>
+          <w:rStyle w:val="VerbatimChar"/>
+        </w:rPr>
+        <w:t xml:space="preserve">witness-testbeds</w:t>
+      </w:r>
+      <w:r>
+        <w:t xml:space="preserve"> </w:t>
+      </w:r>
+      <w:r>
+        <w:t xml:space="preserve">repo)</w:t>
+      </w:r>
+      <w:r>
+        <w:br/>
+      </w:r>
+      <w:r>
+        <w:rPr>
+          <w:bCs/>
+          <w:b/>
+        </w:rPr>
+        <w:t xml:space="preserve">Zenodo DOI:</w:t>
+      </w:r>
+      <w:r>
+        <w:t xml:space="preserve"> </w:t>
+      </w:r>
+      <w:hyperlink r:id="rId42">
+        <w:r>
+          <w:rPr>
+            <w:rStyle w:val="Hyperlink"/>
+          </w:rPr>
+          <w:t xml:space="preserve">10.5281/zenodo.21434832</w:t>
+        </w:r>
+      </w:hyperlink>
+      <w:r>
+        <w:br/>
+      </w:r>
+      <w:r>
+        <w:rPr>
+          <w:bCs/>
+          <w:b/>
+        </w:rPr>
         <w:t xml:space="preserve">Report generated:</w:t>
       </w:r>
       <w:r>
@@ -4567,8 +4628,8 @@
         <w:t xml:space="preserve">Soli Deo Gloria.</w:t>
       </w:r>
     </w:p>
-    <w:bookmarkEnd w:id="42"/>
     <w:bookmarkEnd w:id="43"/>
+    <w:bookmarkEnd w:id="44"/>
     <w:sectPr/>
   </w:body>
 </w:document>

</xml_diff>